<commit_message>
Add reliable PDF conversion
</commit_message>
<xml_diff>
--- a/examples/templates/styled-status-report.docx
+++ b/examples/templates/styled-status-report.docx
@@ -4,6 +4,7 @@
   <w:body>
     <w:p>
       <w:pPr>
+        <w:spacing w:after="0"/>
         <w:jc w:val="center"/>
       </w:pPr>
       <w:r>
@@ -17,6 +18,7 @@
     </w:p>
     <w:p>
       <w:pPr>
+        <w:spacing w:after="240"/>
         <w:jc w:val="center"/>
       </w:pPr>
       <w:r>
@@ -28,16 +30,63 @@
         <w:t>{{ project.name }}</w:t>
       </w:r>
     </w:p>
-    <w:p/>
     <w:p>
+      <w:pPr>
+        <w:spacing w:before="240" w:after="80"/>
+      </w:pPr>
       <w:r>
         <w:rPr>
           <w:b/>
+          <w:color w:val="1F4E79"/>
+          <w:sz w:val="28"/>
         </w:rPr>
-        <w:t xml:space="preserve">Executive summary: </w:t>
+        <w:t>Executive Summary</w:t>
       </w:r>
+    </w:p>
+    <w:p>
+      <w:pPr>
+        <w:spacing w:after="120"/>
+        <w:pBdr>
+          <w:bottom w:val="single" w:sz="6" w:space="1" w:color="9CC2E5"/>
+        </w:pBdr>
+      </w:pPr>
+      <w:r>
+        <w:rPr>
+          <w:sz w:val="2"/>
+        </w:rPr>
+        <w:t xml:space="preserve"> </w:t>
+      </w:r>
+    </w:p>
+    <w:p>
       <w:r>
         <w:t>{{ summary }}</w:t>
+      </w:r>
+    </w:p>
+    <w:p>
+      <w:pPr>
+        <w:spacing w:before="240" w:after="80"/>
+      </w:pPr>
+      <w:r>
+        <w:rPr>
+          <w:b/>
+          <w:color w:val="1F4E79"/>
+          <w:sz w:val="28"/>
+        </w:rPr>
+        <w:t>Health Snapshot</w:t>
+      </w:r>
+    </w:p>
+    <w:p>
+      <w:pPr>
+        <w:spacing w:after="120"/>
+        <w:pBdr>
+          <w:bottom w:val="single" w:sz="6" w:space="1" w:color="9CC2E5"/>
+        </w:pBdr>
+      </w:pPr>
+      <w:r>
+        <w:rPr>
+          <w:sz w:val="2"/>
+        </w:rPr>
+        <w:t xml:space="preserve"> </w:t>
       </w:r>
     </w:p>
     <w:tbl>
@@ -73,6 +122,9 @@
           </w:tcPr>
           <w:p>
             <w:r>
+              <w:rPr>
+                <w:b w:val="0"/>
+              </w:rPr>
               <w:t>{{ owner.name }}</w:t>
             </w:r>
           </w:p>
@@ -101,6 +153,7 @@
           <w:p>
             <w:r>
               <w:rPr>
+                <w:b w:val="0"/>
                 <w:color w:val="0070C0"/>
               </w:rPr>
               <w:t>{{ status }}</w:t>
@@ -130,21 +183,40 @@
           </w:tcPr>
           <w:p>
             <w:r>
+              <w:rPr>
+                <w:b w:val="0"/>
+              </w:rPr>
               <w:t>{{ report_date }}</w:t>
             </w:r>
           </w:p>
         </w:tc>
       </w:tr>
     </w:tbl>
-    <w:p/>
     <w:p>
+      <w:pPr>
+        <w:spacing w:before="240" w:after="80"/>
+      </w:pPr>
       <w:r>
         <w:rPr>
           <w:b/>
           <w:color w:val="1F4E79"/>
-          <w:sz w:val="30"/>
+          <w:sz w:val="28"/>
         </w:rPr>
         <w:t>Milestones</w:t>
+      </w:r>
+    </w:p>
+    <w:p>
+      <w:pPr>
+        <w:spacing w:after="120"/>
+        <w:pBdr>
+          <w:bottom w:val="single" w:sz="6" w:space="1" w:color="9CC2E5"/>
+        </w:pBdr>
+      </w:pPr>
+      <w:r>
+        <w:rPr>
+          <w:sz w:val="2"/>
+        </w:rPr>
+        <w:t xml:space="preserve"> </w:t>
       </w:r>
     </w:p>
     <w:tbl>
@@ -214,7 +286,10 @@
           </w:tcPr>
           <w:p>
             <w:r>
-              <w:t>{% for item in milestones %}{{ item.name }}</w:t>
+              <w:rPr>
+                <w:b w:val="0"/>
+              </w:rPr>
+              <w:t>{{ milestones[0].name }}</w:t>
             </w:r>
           </w:p>
         </w:tc>
@@ -225,7 +300,10 @@
           </w:tcPr>
           <w:p>
             <w:r>
-              <w:t>{{ item.owner }}</w:t>
+              <w:rPr>
+                <w:b w:val="0"/>
+              </w:rPr>
+              <w:t>{{ milestones[0].owner }}</w:t>
             </w:r>
           </w:p>
         </w:tc>
@@ -236,13 +314,130 @@
           </w:tcPr>
           <w:p>
             <w:r>
-              <w:t>{{ item.due }}{% endfor %}</w:t>
+              <w:rPr>
+                <w:b w:val="0"/>
+              </w:rPr>
+              <w:t>{{ milestones[0].due }}</w:t>
+            </w:r>
+          </w:p>
+        </w:tc>
+      </w:tr>
+      <w:tr>
+        <w:tc>
+          <w:tcPr>
+            <w:tcW w:type="dxa" w:w="3312"/>
+            <w:shd w:fill="FFFFFF"/>
+          </w:tcPr>
+          <w:p>
+            <w:r>
+              <w:rPr>
+                <w:b w:val="0"/>
+              </w:rPr>
+              <w:t>{{ milestones[1].name }}</w:t>
+            </w:r>
+          </w:p>
+        </w:tc>
+        <w:tc>
+          <w:tcPr>
+            <w:tcW w:type="dxa" w:w="3312"/>
+            <w:shd w:fill="FFFFFF"/>
+          </w:tcPr>
+          <w:p>
+            <w:r>
+              <w:rPr>
+                <w:b w:val="0"/>
+              </w:rPr>
+              <w:t>{{ milestones[1].owner }}</w:t>
+            </w:r>
+          </w:p>
+        </w:tc>
+        <w:tc>
+          <w:tcPr>
+            <w:tcW w:type="dxa" w:w="3312"/>
+            <w:shd w:fill="FFFFFF"/>
+          </w:tcPr>
+          <w:p>
+            <w:r>
+              <w:rPr>
+                <w:b w:val="0"/>
+              </w:rPr>
+              <w:t>{{ milestones[1].due }}</w:t>
+            </w:r>
+          </w:p>
+        </w:tc>
+      </w:tr>
+      <w:tr>
+        <w:tc>
+          <w:tcPr>
+            <w:tcW w:type="dxa" w:w="3312"/>
+            <w:shd w:fill="F7FBFD"/>
+          </w:tcPr>
+          <w:p>
+            <w:r>
+              <w:rPr>
+                <w:b w:val="0"/>
+              </w:rPr>
+              <w:t>{{ milestones[2].name }}</w:t>
+            </w:r>
+          </w:p>
+        </w:tc>
+        <w:tc>
+          <w:tcPr>
+            <w:tcW w:type="dxa" w:w="3312"/>
+            <w:shd w:fill="F7FBFD"/>
+          </w:tcPr>
+          <w:p>
+            <w:r>
+              <w:rPr>
+                <w:b w:val="0"/>
+              </w:rPr>
+              <w:t>{{ milestones[2].owner }}</w:t>
+            </w:r>
+          </w:p>
+        </w:tc>
+        <w:tc>
+          <w:tcPr>
+            <w:tcW w:type="dxa" w:w="3312"/>
+            <w:shd w:fill="F7FBFD"/>
+          </w:tcPr>
+          <w:p>
+            <w:r>
+              <w:rPr>
+                <w:b w:val="0"/>
+              </w:rPr>
+              <w:t>{{ milestones[2].due }}</w:t>
             </w:r>
           </w:p>
         </w:tc>
       </w:tr>
     </w:tbl>
-    <w:p/>
+    <w:p>
+      <w:pPr>
+        <w:spacing w:before="240" w:after="80"/>
+      </w:pPr>
+      <w:r>
+        <w:rPr>
+          <w:b/>
+          <w:color w:val="1F4E79"/>
+          <w:sz w:val="28"/>
+        </w:rPr>
+        <w:t>Risk Note</w:t>
+      </w:r>
+    </w:p>
+    <w:p>
+      <w:pPr>
+        <w:spacing w:after="120"/>
+        <w:pBdr>
+          <w:bottom w:val="single" w:sz="6" w:space="1" w:color="9CC2E5"/>
+        </w:pBdr>
+      </w:pPr>
+      <w:r>
+        <w:rPr>
+          <w:sz w:val="2"/>
+        </w:rPr>
+        <w:t xml:space="preserve"> </w:t>
+      </w:r>
+    </w:p>
     <w:p>
       <w:r>
         <w:rPr>
@@ -253,6 +448,8 @@
       </w:r>
     </w:p>
     <w:sectPr>
+      <w:headerReference w:type="default" r:id="rId9"/>
+      <w:footerReference w:type="default" r:id="rId10"/>
       <w:pgSz w:w="12240" w:h="15840"/>
       <w:pgMar w:top="1008" w:right="1152" w:bottom="1008" w:left="1152" w:header="720" w:footer="720" w:gutter="0"/>
       <w:cols w:space="720"/>
@@ -260,6 +457,80 @@
     </w:sectPr>
   </w:body>
 </w:document>
+</file>
+
+<file path=word/footer1.xml><?xml version="1.0" encoding="utf-8"?>
+<w:ftr xmlns:m="http://schemas.openxmlformats.org/officeDocument/2006/math" xmlns:mc="http://schemas.openxmlformats.org/markup-compatibility/2006" xmlns:mo="http://schemas.microsoft.com/office/mac/office/2008/main" xmlns:mv="urn:schemas-microsoft-com:mac:vml" xmlns:o="urn:schemas-microsoft-com:office:office" xmlns:r="http://schemas.openxmlformats.org/officeDocument/2006/relationships" xmlns:v="urn:schemas-microsoft-com:vml" xmlns:w10="urn:schemas-microsoft-com:office:word" xmlns:w14="http://schemas.microsoft.com/office/word/2010/wordml" xmlns:w="http://schemas.openxmlformats.org/wordprocessingml/2006/main" xmlns:wne="http://schemas.microsoft.com/office/word/2006/wordml" xmlns:wp14="http://schemas.microsoft.com/office/word/2010/wordprocessingDrawing" xmlns:wp="http://schemas.openxmlformats.org/drawingml/2006/wordprocessingDrawing" xmlns:wpc="http://schemas.microsoft.com/office/word/2010/wordprocessingCanvas" xmlns:wpg="http://schemas.microsoft.com/office/word/2010/wordprocessingGroup" xmlns:wpi="http://schemas.microsoft.com/office/word/2010/wordprocessingInk" xmlns:wps="http://schemas.microsoft.com/office/word/2010/wordprocessingShape" mc:Ignorable="w14 wp14">
+  <w:p>
+    <w:pPr>
+      <w:pStyle w:val="Footer"/>
+      <w:jc w:val="center"/>
+    </w:pPr>
+    <w:r>
+      <w:rPr>
+        <w:color w:val="7F7F7F"/>
+        <w:sz w:val="16"/>
+      </w:rPr>
+      <w:t>Generated from a DOCX template with Stencil</w:t>
+    </w:r>
+  </w:p>
+</w:ftr>
+</file>
+
+<file path=word/header1.xml><?xml version="1.0" encoding="utf-8"?>
+<w:hdr xmlns:m="http://schemas.openxmlformats.org/officeDocument/2006/math" xmlns:mc="http://schemas.openxmlformats.org/markup-compatibility/2006" xmlns:mo="http://schemas.microsoft.com/office/mac/office/2008/main" xmlns:mv="urn:schemas-microsoft-com:mac:vml" xmlns:o="urn:schemas-microsoft-com:office:office" xmlns:r="http://schemas.openxmlformats.org/officeDocument/2006/relationships" xmlns:v="urn:schemas-microsoft-com:vml" xmlns:w10="urn:schemas-microsoft-com:office:word" xmlns:w14="http://schemas.microsoft.com/office/word/2010/wordml" xmlns:w="http://schemas.openxmlformats.org/wordprocessingml/2006/main" xmlns:wne="http://schemas.microsoft.com/office/word/2006/wordml" xmlns:wp14="http://schemas.microsoft.com/office/word/2010/wordprocessingDrawing" xmlns:wp="http://schemas.openxmlformats.org/drawingml/2006/wordprocessingDrawing" xmlns:wpc="http://schemas.microsoft.com/office/word/2010/wordprocessingCanvas" xmlns:wpg="http://schemas.microsoft.com/office/word/2010/wordprocessingGroup" xmlns:wpi="http://schemas.microsoft.com/office/word/2010/wordprocessingInk" xmlns:wps="http://schemas.microsoft.com/office/word/2010/wordprocessingShape" mc:Ignorable="w14 wp14">
+  <w:p>
+    <w:pPr>
+      <w:pStyle w:val="Header"/>
+    </w:pPr>
+  </w:p>
+  <w:tbl>
+    <w:tblPr>
+      <w:tblW w:type="auto" w:w="0"/>
+      <w:jc w:val="center"/>
+      <w:tblLook w:firstColumn="1" w:firstRow="1" w:lastColumn="0" w:lastRow="0" w:noHBand="0" w:noVBand="1" w:val="04A0"/>
+    </w:tblPr>
+    <w:tblGrid>
+      <w:gridCol w:w="4896"/>
+      <w:gridCol w:w="4896"/>
+    </w:tblGrid>
+    <w:tr>
+      <w:tc>
+        <w:tcPr>
+          <w:tcW w:type="dxa" w:w="4896"/>
+          <w:shd w:fill="1F4E79"/>
+        </w:tcPr>
+        <w:p>
+          <w:r>
+            <w:rPr>
+              <w:b/>
+              <w:color w:val="FFFFFF"/>
+            </w:rPr>
+            <w:t>STENCIL STATUS</w:t>
+          </w:r>
+        </w:p>
+      </w:tc>
+      <w:tc>
+        <w:tcPr>
+          <w:tcW w:type="dxa" w:w="4896"/>
+          <w:shd w:fill="1F4E79"/>
+        </w:tcPr>
+        <w:p>
+          <w:pPr>
+            <w:jc w:val="right"/>
+          </w:pPr>
+          <w:r>
+            <w:rPr>
+              <w:b/>
+              <w:color w:val="FFFFFF"/>
+            </w:rPr>
+            <w:t>{{ report_date }}</w:t>
+          </w:r>
+        </w:p>
+      </w:tc>
+    </w:tr>
+  </w:tbl>
+</w:hdr>
 </file>
 
 <file path=word/numbering.xml><?xml version="1.0" encoding="utf-8"?>

</xml_diff>